<commit_message>
data: rebind canonical report and manuscript exports
</commit_message>
<xml_diff>
--- a/docs/paper_artifacts/final/deliverables/POI_MPP_PUBLICATION_DRAFT.docx
+++ b/docs/paper_artifacts/final/deliverables/POI_MPP_PUBLICATION_DRAFT.docx
@@ -83,7 +83,7 @@
           <w:sz w:val="17"/>
           <w:szCs w:val="17"/>
         </w:rPr>
-        <w:t xml:space="preserve">bd882ca072602e13cc14850a44d1b769111f6b032e56901e9419a3263593c</w:t>
+        <w:t xml:space="preserve">9c5d914d4a1eca35589bacf0a889da86adef7027a17d19612ce8ef2b49525bad</w:t>
       </w:r>
     </w:p>
     <w:p>
@@ -141,7 +141,7 @@
           <w:color w:val="1F4E5F"/>
           <w:shd w:fill="E9F2F4" w:val="clear"/>
         </w:rPr>
-        <w:t xml:space="preserve">bd882ca072602e13cc14850a44d1b769111f6b032e56901e9419a3263593c943</w:t>
+        <w:t xml:space="preserve">9c5d914d4a1eca35589bacf0a889da86adef7027a17d19612ce8ef2b49525bad</w:t>
       </w:r>
       <w:r>
         <w:t xml:space="preserve">) records </w:t>
@@ -348,7 +348,7 @@
                 <w:szCs w:val="18"/>
                 <w:shd w:fill="E9F2F4" w:val="clear"/>
               </w:rPr>
-              <w:t xml:space="preserve">bd882ca072602e13cc14850a44d1b769111f6b032e56901e9419a3263593c943</w:t>
+              <w:t xml:space="preserve">9c5d914d4a1eca35589bacf0a889da86adef7027a17d19612ce8ef2b49525bad</w:t>
             </w:r>
           </w:p>
         </w:tc>
@@ -3450,7 +3450,7 @@
           <w:color w:val="1F4E5F"/>
           <w:shd w:fill="E9F2F4" w:val="clear"/>
         </w:rPr>
-        <w:t xml:space="preserve">bd882ca072602e13cc14850a44d1b769111f6b032e56901e9419a3263593c943</w:t>
+        <w:t xml:space="preserve">9c5d914d4a1eca35589bacf0a889da86adef7027a17d19612ce8ef2b49525bad</w:t>
       </w:r>
       <w:r>
         <w:t xml:space="preserve">. It includes the claim matrix, omission ledger, and E1, E2, E4-E8 artifacts. Its presence does not authorize submission: E3 authority, authenticated independent manual review, and the publication-freeze sentinel remain open gates.</w:t>

</xml_diff>

<commit_message>
docs: rebuild canonical V4 publication package
</commit_message>
<xml_diff>
--- a/docs/paper_artifacts/final/deliverables/POI_MPP_PUBLICATION_DRAFT.docx
+++ b/docs/paper_artifacts/final/deliverables/POI_MPP_PUBLICATION_DRAFT.docx
@@ -83,7 +83,7 @@
           <w:sz w:val="17"/>
           <w:szCs w:val="17"/>
         </w:rPr>
-        <w:t xml:space="preserve">9c5d914d4a1eca35589bacf0a889da86adef7027a17d19612ce8ef2b49525bad</w:t>
+        <w:t xml:space="preserve">416c4fd909e10304c361af056f0fddbc3ab47c67aeedad8f22fb69d839801e49</w:t>
       </w:r>
     </w:p>
     <w:p>
@@ -141,7 +141,7 @@
           <w:color w:val="1F4E5F"/>
           <w:shd w:fill="E9F2F4" w:val="clear"/>
         </w:rPr>
-        <w:t xml:space="preserve">9c5d914d4a1eca35589bacf0a889da86adef7027a17d19612ce8ef2b49525bad</w:t>
+        <w:t xml:space="preserve">416c4fd909e10304c361af056f0fddbc3ab47c67aeedad8f22fb69d839801e49</w:t>
       </w:r>
       <w:r>
         <w:t xml:space="preserve">) records </w:t>
@@ -348,7 +348,7 @@
                 <w:szCs w:val="18"/>
                 <w:shd w:fill="E9F2F4" w:val="clear"/>
               </w:rPr>
-              <w:t xml:space="preserve">9c5d914d4a1eca35589bacf0a889da86adef7027a17d19612ce8ef2b49525bad</w:t>
+              <w:t xml:space="preserve">416c4fd909e10304c361af056f0fddbc3ab47c67aeedad8f22fb69d839801e49</w:t>
             </w:r>
           </w:p>
         </w:tc>
@@ -3450,7 +3450,7 @@
           <w:color w:val="1F4E5F"/>
           <w:shd w:fill="E9F2F4" w:val="clear"/>
         </w:rPr>
-        <w:t xml:space="preserve">9c5d914d4a1eca35589bacf0a889da86adef7027a17d19612ce8ef2b49525bad</w:t>
+        <w:t xml:space="preserve">416c4fd909e10304c361af056f0fddbc3ab47c67aeedad8f22fb69d839801e49</w:t>
       </w:r>
       <w:r>
         <w:t xml:space="preserve">. It includes the claim matrix, omission ledger, and E1, E2, E4-E8 artifacts. Its presence does not authorize submission: E3 authority, authenticated independent manual review, and the publication-freeze sentinel remain open gates.</w:t>

</xml_diff>